<commit_message>
fix: atualizar nome do aluno para Otávio Vianna Lima e remover datas de entrega e publicacao
</commit_message>
<xml_diff>
--- a/Relatorio_Computacao_em_Nuvem_I.docx
+++ b/Relatorio_Computacao_em_Nuvem_I.docx
@@ -7,7 +7,7 @@
       <w:pPr>
         <w:pStyle w:val="Heading1"/>
         <w:shd w:val="clear" w:color="auto" w:fill="F8FAFC"/>
-        <w:divId w:val="1592424014"/>
+        <w:divId w:val="790587431"/>
         <w:rPr>
           <w:rFonts w:ascii="Segoe UI" w:eastAsia="Times New Roman" w:hAnsi="Segoe UI" w:cs="Segoe UI"/>
         </w:rPr>
@@ -22,7 +22,7 @@
     <w:p>
       <w:pPr>
         <w:shd w:val="clear" w:color="auto" w:fill="F8FAFC"/>
-        <w:divId w:val="969364937"/>
+        <w:divId w:val="746612299"/>
         <w:rPr>
           <w:rFonts w:ascii="Segoe UI" w:eastAsia="Times New Roman" w:hAnsi="Segoe UI" w:cs="Segoe UI"/>
           <w:b/>
@@ -53,13 +53,13 @@
       </w:tblPr>
       <w:tblGrid>
         <w:gridCol w:w="2122"/>
-        <w:gridCol w:w="1954"/>
+        <w:gridCol w:w="1791"/>
         <w:gridCol w:w="2122"/>
-        <w:gridCol w:w="2290"/>
+        <w:gridCol w:w="2453"/>
       </w:tblGrid>
       <w:tr>
         <w:trPr>
-          <w:divId w:val="1592424014"/>
+          <w:divId w:val="790587431"/>
         </w:trPr>
         <w:tc>
           <w:tcPr>
@@ -141,7 +141,7 @@
                 <w:sz w:val="20"/>
                 <w:szCs w:val="20"/>
               </w:rPr>
-              <w:t>[Preencha seu Nome Completo]</w:t>
+              <w:t>Otávio Vianna Lima</w:t>
             </w:r>
           </w:p>
         </w:tc>
@@ -232,7 +232,7 @@
       </w:tr>
       <w:tr>
         <w:trPr>
-          <w:divId w:val="1592424014"/>
+          <w:divId w:val="790587431"/>
         </w:trPr>
         <w:tc>
           <w:tcPr>
@@ -274,13 +274,14 @@
                 <w:sz w:val="20"/>
                 <w:szCs w:val="20"/>
               </w:rPr>
-              <w:t>Data de Entrega:</w:t>
+              <w:t>Formato de Entrega:</w:t>
             </w:r>
           </w:p>
         </w:tc>
         <w:tc>
           <w:tcPr>
             <w:tcW w:w="0" w:type="auto"/>
+            <w:gridSpan w:val="3"/>
             <w:tcBorders>
               <w:top w:val="single" w:sz="6" w:space="0" w:color="CBD5E1"/>
               <w:left w:val="single" w:sz="6" w:space="0" w:color="CBD5E1"/>
@@ -308,96 +309,12 @@
             </w:pPr>
             <w:r>
               <w:rPr>
-                <w:rStyle w:val="Strong"/>
                 <w:rFonts w:ascii="Segoe UI" w:eastAsia="Times New Roman" w:hAnsi="Segoe UI" w:cs="Segoe UI"/>
                 <w:color w:val="1A1A1A"/>
                 <w:sz w:val="20"/>
                 <w:szCs w:val="20"/>
               </w:rPr>
-              <w:t>27/09/2026</w:t>
-            </w:r>
-          </w:p>
-        </w:tc>
-        <w:tc>
-          <w:tcPr>
-            <w:tcW w:w="1250" w:type="pct"/>
-            <w:tcBorders>
-              <w:top w:val="single" w:sz="6" w:space="0" w:color="CBD5E1"/>
-              <w:left w:val="single" w:sz="6" w:space="0" w:color="CBD5E1"/>
-              <w:bottom w:val="single" w:sz="6" w:space="0" w:color="CBD5E1"/>
-              <w:right w:val="single" w:sz="6" w:space="0" w:color="CBD5E1"/>
-            </w:tcBorders>
-            <w:shd w:val="clear" w:color="auto" w:fill="E2E8F0"/>
-            <w:tcMar>
-              <w:top w:w="120" w:type="dxa"/>
-              <w:left w:w="180" w:type="dxa"/>
-              <w:bottom w:w="120" w:type="dxa"/>
-              <w:right w:w="180" w:type="dxa"/>
-            </w:tcMar>
-            <w:vAlign w:val="center"/>
-            <w:hideMark/>
-          </w:tcPr>
-          <w:p>
-            <w:pPr>
-              <w:spacing w:before="150"/>
-              <w:rPr>
-                <w:rFonts w:ascii="Segoe UI" w:eastAsia="Times New Roman" w:hAnsi="Segoe UI" w:cs="Segoe UI"/>
-                <w:b/>
-                <w:bCs/>
-                <w:color w:val="1E293B"/>
-                <w:sz w:val="20"/>
-                <w:szCs w:val="20"/>
-              </w:rPr>
-            </w:pPr>
-            <w:r>
-              <w:rPr>
-                <w:rFonts w:ascii="Segoe UI" w:eastAsia="Times New Roman" w:hAnsi="Segoe UI" w:cs="Segoe UI"/>
-                <w:b/>
-                <w:bCs/>
-                <w:color w:val="1E293B"/>
-                <w:sz w:val="20"/>
-                <w:szCs w:val="20"/>
-              </w:rPr>
-              <w:t>Formato:</w:t>
-            </w:r>
-          </w:p>
-        </w:tc>
-        <w:tc>
-          <w:tcPr>
-            <w:tcW w:w="0" w:type="auto"/>
-            <w:tcBorders>
-              <w:top w:val="single" w:sz="6" w:space="0" w:color="CBD5E1"/>
-              <w:left w:val="single" w:sz="6" w:space="0" w:color="CBD5E1"/>
-              <w:bottom w:val="single" w:sz="6" w:space="0" w:color="CBD5E1"/>
-              <w:right w:val="single" w:sz="6" w:space="0" w:color="CBD5E1"/>
-            </w:tcBorders>
-            <w:tcMar>
-              <w:top w:w="120" w:type="dxa"/>
-              <w:left w:w="180" w:type="dxa"/>
-              <w:bottom w:w="120" w:type="dxa"/>
-              <w:right w:w="180" w:type="dxa"/>
-            </w:tcMar>
-            <w:vAlign w:val="center"/>
-            <w:hideMark/>
-          </w:tcPr>
-          <w:p>
-            <w:pPr>
-              <w:spacing w:before="150"/>
-              <w:rPr>
-                <w:rFonts w:ascii="Segoe UI" w:eastAsia="Times New Roman" w:hAnsi="Segoe UI" w:cs="Segoe UI"/>
-                <w:color w:val="1A1A1A"/>
-                <w:sz w:val="20"/>
-                <w:szCs w:val="20"/>
-              </w:rPr>
-            </w:pPr>
-            <w:r>
-              <w:rPr>
-                <w:rFonts w:ascii="Segoe UI" w:eastAsia="Times New Roman" w:hAnsi="Segoe UI" w:cs="Segoe UI"/>
-                <w:color w:val="1A1A1A"/>
-                <w:sz w:val="20"/>
-                <w:szCs w:val="20"/>
-              </w:rPr>
-              <w:t>Relatório Técnico Escrito e Evidências Práticas</w:t>
+              <w:t>Relatório Técnico com respostas dissertativas fundamentadas, matrizes comparativas e evidências de prática hands-on.</w:t>
             </w:r>
           </w:p>
         </w:tc>
@@ -719,31 +636,40 @@
           <w:sz w:val="22"/>
           <w:szCs w:val="22"/>
         </w:rPr>
+        <w:t>Manutenção de Infraestrutura e Hardware:</w:t>
+      </w:r>
+      <w:r>
+        <w:rPr>
+          <w:rFonts w:ascii="Segoe UI" w:eastAsia="Times New Roman" w:hAnsi="Segoe UI" w:cs="Segoe UI"/>
+          <w:color w:val="1A1A1A"/>
+          <w:sz w:val="22"/>
+          <w:szCs w:val="22"/>
+        </w:rPr>
+        <w:t xml:space="preserve"> </w:t>
+      </w:r>
+      <w:r>
+        <w:rPr>
+          <w:rFonts w:ascii="Segoe UI" w:eastAsia="Times New Roman" w:hAnsi="Segoe UI" w:cs="Segoe UI"/>
+          <w:color w:val="1A1A1A"/>
+          <w:sz w:val="22"/>
+          <w:szCs w:val="22"/>
+        </w:rPr>
+        <w:t xml:space="preserve">Na TI local, a equipe interna é integralmente responsável pela manutenção física, troca de discos danificados, no-breaks, refrigeração e segurança perimetral física. Na nuvem, o provedor </w:t>
+      </w:r>
+      <w:r>
+        <w:rPr>
+          <w:rFonts w:ascii="Segoe UI" w:eastAsia="Times New Roman" w:hAnsi="Segoe UI" w:cs="Segoe UI"/>
+          <w:color w:val="1A1A1A"/>
+          <w:sz w:val="22"/>
+          <w:szCs w:val="22"/>
+        </w:rPr>
         <w:lastRenderedPageBreak/>
-        <w:t>Manutenção de Infraestrutura e Hardware:</w:t>
-      </w:r>
-      <w:r>
-        <w:rPr>
-          <w:rFonts w:ascii="Segoe UI" w:eastAsia="Times New Roman" w:hAnsi="Segoe UI" w:cs="Segoe UI"/>
-          <w:color w:val="1A1A1A"/>
-          <w:sz w:val="22"/>
-          <w:szCs w:val="22"/>
-        </w:rPr>
-        <w:t xml:space="preserve"> </w:t>
-      </w:r>
-      <w:r>
-        <w:rPr>
-          <w:rFonts w:ascii="Segoe UI" w:eastAsia="Times New Roman" w:hAnsi="Segoe UI" w:cs="Segoe UI"/>
-          <w:color w:val="1A1A1A"/>
-          <w:sz w:val="22"/>
-          <w:szCs w:val="22"/>
-        </w:rPr>
-        <w:t>Na TI local, a equipe interna é integralmente responsável pela manutenção física, troca de discos danificados, no-breaks, refrigeração e segurança perimetral física. Na nuvem, o provedor assume 100% da manutenção física e resiliência do data center sob rigorosos acordos de nível de serviço (SLAs), permitindo que a equipe corporativa foque em inovação e regras de negócio.</w:t>
+        <w:t>assume 100% da manutenção física e resiliência do data center sob rigorosos acordos de nível de serviço (SLAs), permitindo que a equipe corporativa foque em inovação e regras de negócio.</w:t>
       </w:r>
     </w:p>
     <w:p>
       <w:pPr>
-        <w:divId w:val="1305502370"/>
+        <w:divId w:val="671763718"/>
         <w:rPr>
           <w:rFonts w:ascii="Segoe UI" w:eastAsia="Times New Roman" w:hAnsi="Segoe UI" w:cs="Segoe UI"/>
           <w:i/>
@@ -1255,7 +1181,7 @@
     </w:p>
     <w:p>
       <w:pPr>
-        <w:divId w:val="107749049"/>
+        <w:divId w:val="1453135242"/>
         <w:rPr>
           <w:rFonts w:ascii="Segoe UI" w:eastAsia="Times New Roman" w:hAnsi="Segoe UI" w:cs="Segoe UI"/>
           <w:i/>
@@ -1288,7 +1214,6 @@
         <w:rPr>
           <w:rFonts w:ascii="Segoe UI" w:eastAsia="Times New Roman" w:hAnsi="Segoe UI" w:cs="Segoe UI"/>
         </w:rPr>
-        <w:lastRenderedPageBreak/>
         <w:t>3. Situações de opção por Nuvem Híbrida em vez de Pública Pura no setor fortemente regulado (Setor Bancário).</w:t>
       </w:r>
     </w:p>
@@ -1329,6 +1254,7 @@
           <w:sz w:val="22"/>
           <w:szCs w:val="22"/>
         </w:rPr>
+        <w:lastRenderedPageBreak/>
         <w:t xml:space="preserve">No </w:t>
       </w:r>
       <w:r>
@@ -1515,7 +1441,7 @@
     </w:p>
     <w:p>
       <w:pPr>
-        <w:divId w:val="243875725"/>
+        <w:divId w:val="1915508511"/>
         <w:rPr>
           <w:rFonts w:ascii="Segoe UI" w:eastAsia="Times New Roman" w:hAnsi="Segoe UI" w:cs="Segoe UI"/>
           <w:i/>
@@ -3449,7 +3375,7 @@
     </w:p>
     <w:p>
       <w:pPr>
-        <w:divId w:val="2120686478"/>
+        <w:divId w:val="921140266"/>
         <w:rPr>
           <w:rFonts w:ascii="Segoe UI" w:eastAsia="Times New Roman" w:hAnsi="Segoe UI" w:cs="Segoe UI"/>
           <w:i/>
@@ -3669,7 +3595,7 @@
     </w:p>
     <w:p>
       <w:pPr>
-        <w:divId w:val="226303722"/>
+        <w:divId w:val="1230074980"/>
         <w:rPr>
           <w:rFonts w:ascii="Segoe UI" w:eastAsia="Times New Roman" w:hAnsi="Segoe UI" w:cs="Segoe UI"/>
           <w:i/>
@@ -3923,7 +3849,7 @@
     </w:p>
     <w:p>
       <w:pPr>
-        <w:divId w:val="1351293177"/>
+        <w:divId w:val="2054035463"/>
         <w:rPr>
           <w:rFonts w:ascii="Segoe UI" w:eastAsia="Times New Roman" w:hAnsi="Segoe UI" w:cs="Segoe UI"/>
           <w:i/>
@@ -4154,7 +4080,7 @@
     </w:p>
     <w:p>
       <w:pPr>
-        <w:divId w:val="471751601"/>
+        <w:divId w:val="1126194410"/>
         <w:rPr>
           <w:rFonts w:ascii="Segoe UI" w:eastAsia="Times New Roman" w:hAnsi="Segoe UI" w:cs="Segoe UI"/>
           <w:i/>
@@ -6707,7 +6633,7 @@
     <w:p>
       <w:pPr>
         <w:shd w:val="clear" w:color="auto" w:fill="EFF6FF"/>
-        <w:divId w:val="1842236823"/>
+        <w:divId w:val="1185746954"/>
         <w:rPr>
           <w:rFonts w:ascii="Segoe UI" w:eastAsia="Times New Roman" w:hAnsi="Segoe UI" w:cs="Segoe UI"/>
           <w:color w:val="1A1A1A"/>
@@ -8442,9 +8368,9 @@
 <file path=word/numbering.xml><?xml version="1.0" encoding="utf-8"?>
 <w:numbering xmlns:wpc="http://schemas.microsoft.com/office/word/2010/wordprocessingCanvas" xmlns:cx="http://schemas.microsoft.com/office/drawing/2014/chartex" xmlns:cx1="http://schemas.microsoft.com/office/drawing/2015/9/8/chartex" xmlns:cx2="http://schemas.microsoft.com/office/drawing/2015/10/21/chartex" xmlns:cx3="http://schemas.microsoft.com/office/drawing/2016/5/9/chartex" xmlns:cx4="http://schemas.microsoft.com/office/drawing/2016/5/10/chartex" xmlns:cx5="http://schemas.microsoft.com/office/drawing/2016/5/11/chartex" xmlns:cx6="http://schemas.microsoft.com/office/drawing/2016/5/12/chartex" xmlns:cx7="http://schemas.microsoft.com/office/drawing/2016/5/13/chartex" xmlns:cx8="http://schemas.microsoft.com/office/drawing/2016/5/14/chartex" xmlns:mc="http://schemas.openxmlformats.org/markup-compatibility/2006" xmlns:aink="http://schemas.microsoft.com/office/drawing/2016/ink" xmlns:am3d="http://schemas.microsoft.com/office/drawing/2017/model3d" xmlns:o="urn:schemas-microsoft-com:office:office" xmlns:oel="http://schemas.microsoft.com/office/2019/extlst" xmlns:r="http://schemas.openxmlformats.org/officeDocument/2006/relationships" xmlns:m="http://schemas.openxmlformats.org/officeDocument/2006/math" xmlns:v="urn:schemas-microsoft-com:vml" xmlns:wp14="http://schemas.microsoft.com/office/word/2010/wordprocessingDrawing" xmlns:wp="http://schemas.openxmlformats.org/drawingml/2006/wordprocessingDrawing" xmlns:w10="urn:schemas-microsoft-com:office:word" xmlns:w="http://schemas.openxmlformats.org/wordprocessingml/2006/main" xmlns:w14="http://schemas.microsoft.com/office/word/2010/wordml" xmlns:w15="http://schemas.microsoft.com/office/word/2012/wordml" xmlns:w16cex="http://schemas.microsoft.com/office/word/2018/wordml/cex" xmlns:w16cid="http://schemas.microsoft.com/office/word/2016/wordml/cid" xmlns:w16="http://schemas.microsoft.com/office/word/2018/wordml" xmlns:w16du="http://schemas.microsoft.com/office/word/2023/wordml/word16du" xmlns:w16sdtdh="http://schemas.microsoft.com/office/word/2020/wordml/sdtdatahash" xmlns:w16sdtfl="http://schemas.microsoft.com/office/word/2024/wordml/sdtformatlock" xmlns:w16se="http://schemas.microsoft.com/office/word/2015/wordml/symex" xmlns:wpg="http://schemas.microsoft.com/office/word/2010/wordprocessingGroup" xmlns:wpi="http://schemas.microsoft.com/office/word/2010/wordprocessingInk" xmlns:wne="http://schemas.microsoft.com/office/word/2006/wordml" xmlns:wps="http://schemas.microsoft.com/office/word/2010/wordprocessingShape" mc:Ignorable="w14 w15 w16se w16cid w16 w16cex w16sdtdh w16sdtfl w16du wp14">
   <w:abstractNum w:abstractNumId="0" w15:restartNumberingAfterBreak="0">
-    <w:nsid w:val="10676E99"/>
+    <w:nsid w:val="04FC5529"/>
     <w:multiLevelType w:val="multilevel"/>
-    <w:tmpl w:val="7294F7AA"/>
+    <w:tmpl w:val="B59E21AA"/>
     <w:lvl w:ilvl="0">
       <w:start w:val="1"/>
       <w:numFmt w:val="bullet"/>
@@ -8591,9 +8517,9 @@
     </w:lvl>
   </w:abstractNum>
   <w:abstractNum w:abstractNumId="1" w15:restartNumberingAfterBreak="0">
-    <w:nsid w:val="175F48C5"/>
+    <w:nsid w:val="077F35F7"/>
     <w:multiLevelType w:val="multilevel"/>
-    <w:tmpl w:val="CDCEFE76"/>
+    <w:tmpl w:val="F206549A"/>
     <w:lvl w:ilvl="0">
       <w:start w:val="1"/>
       <w:numFmt w:val="bullet"/>
@@ -8740,9 +8666,235 @@
     </w:lvl>
   </w:abstractNum>
   <w:abstractNum w:abstractNumId="2" w15:restartNumberingAfterBreak="0">
-    <w:nsid w:val="21E92D67"/>
+    <w:nsid w:val="1F0F34E9"/>
     <w:multiLevelType w:val="multilevel"/>
-    <w:tmpl w:val="F104A812"/>
+    <w:tmpl w:val="214E2446"/>
+    <w:lvl w:ilvl="0">
+      <w:start w:val="1"/>
+      <w:numFmt w:val="decimal"/>
+      <w:lvlText w:val="%1."/>
+      <w:lvlJc w:val="left"/>
+      <w:pPr>
+        <w:tabs>
+          <w:tab w:val="num" w:pos="720"/>
+        </w:tabs>
+        <w:ind w:left="720" w:hanging="360"/>
+      </w:pPr>
+    </w:lvl>
+    <w:lvl w:ilvl="1" w:tentative="1">
+      <w:start w:val="1"/>
+      <w:numFmt w:val="decimal"/>
+      <w:lvlText w:val="%2."/>
+      <w:lvlJc w:val="left"/>
+      <w:pPr>
+        <w:tabs>
+          <w:tab w:val="num" w:pos="1440"/>
+        </w:tabs>
+        <w:ind w:left="1440" w:hanging="360"/>
+      </w:pPr>
+    </w:lvl>
+    <w:lvl w:ilvl="2" w:tentative="1">
+      <w:start w:val="1"/>
+      <w:numFmt w:val="decimal"/>
+      <w:lvlText w:val="%3."/>
+      <w:lvlJc w:val="left"/>
+      <w:pPr>
+        <w:tabs>
+          <w:tab w:val="num" w:pos="2160"/>
+        </w:tabs>
+        <w:ind w:left="2160" w:hanging="360"/>
+      </w:pPr>
+    </w:lvl>
+    <w:lvl w:ilvl="3" w:tentative="1">
+      <w:start w:val="1"/>
+      <w:numFmt w:val="decimal"/>
+      <w:lvlText w:val="%4."/>
+      <w:lvlJc w:val="left"/>
+      <w:pPr>
+        <w:tabs>
+          <w:tab w:val="num" w:pos="2880"/>
+        </w:tabs>
+        <w:ind w:left="2880" w:hanging="360"/>
+      </w:pPr>
+    </w:lvl>
+    <w:lvl w:ilvl="4" w:tentative="1">
+      <w:start w:val="1"/>
+      <w:numFmt w:val="decimal"/>
+      <w:lvlText w:val="%5."/>
+      <w:lvlJc w:val="left"/>
+      <w:pPr>
+        <w:tabs>
+          <w:tab w:val="num" w:pos="3600"/>
+        </w:tabs>
+        <w:ind w:left="3600" w:hanging="360"/>
+      </w:pPr>
+    </w:lvl>
+    <w:lvl w:ilvl="5" w:tentative="1">
+      <w:start w:val="1"/>
+      <w:numFmt w:val="decimal"/>
+      <w:lvlText w:val="%6."/>
+      <w:lvlJc w:val="left"/>
+      <w:pPr>
+        <w:tabs>
+          <w:tab w:val="num" w:pos="4320"/>
+        </w:tabs>
+        <w:ind w:left="4320" w:hanging="360"/>
+      </w:pPr>
+    </w:lvl>
+    <w:lvl w:ilvl="6" w:tentative="1">
+      <w:start w:val="1"/>
+      <w:numFmt w:val="decimal"/>
+      <w:lvlText w:val="%7."/>
+      <w:lvlJc w:val="left"/>
+      <w:pPr>
+        <w:tabs>
+          <w:tab w:val="num" w:pos="5040"/>
+        </w:tabs>
+        <w:ind w:left="5040" w:hanging="360"/>
+      </w:pPr>
+    </w:lvl>
+    <w:lvl w:ilvl="7" w:tentative="1">
+      <w:start w:val="1"/>
+      <w:numFmt w:val="decimal"/>
+      <w:lvlText w:val="%8."/>
+      <w:lvlJc w:val="left"/>
+      <w:pPr>
+        <w:tabs>
+          <w:tab w:val="num" w:pos="5760"/>
+        </w:tabs>
+        <w:ind w:left="5760" w:hanging="360"/>
+      </w:pPr>
+    </w:lvl>
+    <w:lvl w:ilvl="8" w:tentative="1">
+      <w:start w:val="1"/>
+      <w:numFmt w:val="decimal"/>
+      <w:lvlText w:val="%9."/>
+      <w:lvlJc w:val="left"/>
+      <w:pPr>
+        <w:tabs>
+          <w:tab w:val="num" w:pos="6480"/>
+        </w:tabs>
+        <w:ind w:left="6480" w:hanging="360"/>
+      </w:pPr>
+    </w:lvl>
+  </w:abstractNum>
+  <w:abstractNum w:abstractNumId="3" w15:restartNumberingAfterBreak="0">
+    <w:nsid w:val="2E4141C5"/>
+    <w:multiLevelType w:val="multilevel"/>
+    <w:tmpl w:val="C39CDA2A"/>
+    <w:lvl w:ilvl="0">
+      <w:start w:val="1"/>
+      <w:numFmt w:val="decimal"/>
+      <w:lvlText w:val="%1."/>
+      <w:lvlJc w:val="left"/>
+      <w:pPr>
+        <w:tabs>
+          <w:tab w:val="num" w:pos="720"/>
+        </w:tabs>
+        <w:ind w:left="720" w:hanging="360"/>
+      </w:pPr>
+    </w:lvl>
+    <w:lvl w:ilvl="1" w:tentative="1">
+      <w:start w:val="1"/>
+      <w:numFmt w:val="decimal"/>
+      <w:lvlText w:val="%2."/>
+      <w:lvlJc w:val="left"/>
+      <w:pPr>
+        <w:tabs>
+          <w:tab w:val="num" w:pos="1440"/>
+        </w:tabs>
+        <w:ind w:left="1440" w:hanging="360"/>
+      </w:pPr>
+    </w:lvl>
+    <w:lvl w:ilvl="2" w:tentative="1">
+      <w:start w:val="1"/>
+      <w:numFmt w:val="decimal"/>
+      <w:lvlText w:val="%3."/>
+      <w:lvlJc w:val="left"/>
+      <w:pPr>
+        <w:tabs>
+          <w:tab w:val="num" w:pos="2160"/>
+        </w:tabs>
+        <w:ind w:left="2160" w:hanging="360"/>
+      </w:pPr>
+    </w:lvl>
+    <w:lvl w:ilvl="3" w:tentative="1">
+      <w:start w:val="1"/>
+      <w:numFmt w:val="decimal"/>
+      <w:lvlText w:val="%4."/>
+      <w:lvlJc w:val="left"/>
+      <w:pPr>
+        <w:tabs>
+          <w:tab w:val="num" w:pos="2880"/>
+        </w:tabs>
+        <w:ind w:left="2880" w:hanging="360"/>
+      </w:pPr>
+    </w:lvl>
+    <w:lvl w:ilvl="4" w:tentative="1">
+      <w:start w:val="1"/>
+      <w:numFmt w:val="decimal"/>
+      <w:lvlText w:val="%5."/>
+      <w:lvlJc w:val="left"/>
+      <w:pPr>
+        <w:tabs>
+          <w:tab w:val="num" w:pos="3600"/>
+        </w:tabs>
+        <w:ind w:left="3600" w:hanging="360"/>
+      </w:pPr>
+    </w:lvl>
+    <w:lvl w:ilvl="5" w:tentative="1">
+      <w:start w:val="1"/>
+      <w:numFmt w:val="decimal"/>
+      <w:lvlText w:val="%6."/>
+      <w:lvlJc w:val="left"/>
+      <w:pPr>
+        <w:tabs>
+          <w:tab w:val="num" w:pos="4320"/>
+        </w:tabs>
+        <w:ind w:left="4320" w:hanging="360"/>
+      </w:pPr>
+    </w:lvl>
+    <w:lvl w:ilvl="6" w:tentative="1">
+      <w:start w:val="1"/>
+      <w:numFmt w:val="decimal"/>
+      <w:lvlText w:val="%7."/>
+      <w:lvlJc w:val="left"/>
+      <w:pPr>
+        <w:tabs>
+          <w:tab w:val="num" w:pos="5040"/>
+        </w:tabs>
+        <w:ind w:left="5040" w:hanging="360"/>
+      </w:pPr>
+    </w:lvl>
+    <w:lvl w:ilvl="7" w:tentative="1">
+      <w:start w:val="1"/>
+      <w:numFmt w:val="decimal"/>
+      <w:lvlText w:val="%8."/>
+      <w:lvlJc w:val="left"/>
+      <w:pPr>
+        <w:tabs>
+          <w:tab w:val="num" w:pos="5760"/>
+        </w:tabs>
+        <w:ind w:left="5760" w:hanging="360"/>
+      </w:pPr>
+    </w:lvl>
+    <w:lvl w:ilvl="8" w:tentative="1">
+      <w:start w:val="1"/>
+      <w:numFmt w:val="decimal"/>
+      <w:lvlText w:val="%9."/>
+      <w:lvlJc w:val="left"/>
+      <w:pPr>
+        <w:tabs>
+          <w:tab w:val="num" w:pos="6480"/>
+        </w:tabs>
+        <w:ind w:left="6480" w:hanging="360"/>
+      </w:pPr>
+    </w:lvl>
+  </w:abstractNum>
+  <w:abstractNum w:abstractNumId="4" w15:restartNumberingAfterBreak="0">
+    <w:nsid w:val="362C6EF2"/>
+    <w:multiLevelType w:val="multilevel"/>
+    <w:tmpl w:val="ED4AD7CC"/>
     <w:lvl w:ilvl="0">
       <w:start w:val="1"/>
       <w:numFmt w:val="bullet"/>
@@ -8888,10 +9040,10 @@
       </w:rPr>
     </w:lvl>
   </w:abstractNum>
-  <w:abstractNum w:abstractNumId="3" w15:restartNumberingAfterBreak="0">
-    <w:nsid w:val="2EB76713"/>
+  <w:abstractNum w:abstractNumId="5" w15:restartNumberingAfterBreak="0">
+    <w:nsid w:val="4C1212BD"/>
     <w:multiLevelType w:val="multilevel"/>
-    <w:tmpl w:val="1280F828"/>
+    <w:tmpl w:val="FF7ABA3C"/>
     <w:lvl w:ilvl="0">
       <w:start w:val="1"/>
       <w:numFmt w:val="decimal"/>
@@ -9001,10 +9153,10 @@
       </w:pPr>
     </w:lvl>
   </w:abstractNum>
-  <w:abstractNum w:abstractNumId="4" w15:restartNumberingAfterBreak="0">
-    <w:nsid w:val="305021A6"/>
+  <w:abstractNum w:abstractNumId="6" w15:restartNumberingAfterBreak="0">
+    <w:nsid w:val="566D5456"/>
     <w:multiLevelType w:val="multilevel"/>
-    <w:tmpl w:val="76DEB01E"/>
+    <w:tmpl w:val="6492BBC0"/>
     <w:lvl w:ilvl="0">
       <w:start w:val="1"/>
       <w:numFmt w:val="bullet"/>
@@ -9150,10 +9302,10 @@
       </w:rPr>
     </w:lvl>
   </w:abstractNum>
-  <w:abstractNum w:abstractNumId="5" w15:restartNumberingAfterBreak="0">
-    <w:nsid w:val="33BB5512"/>
+  <w:abstractNum w:abstractNumId="7" w15:restartNumberingAfterBreak="0">
+    <w:nsid w:val="67E2229A"/>
     <w:multiLevelType w:val="multilevel"/>
-    <w:tmpl w:val="BD0C1FF0"/>
+    <w:tmpl w:val="6F56BB0A"/>
     <w:lvl w:ilvl="0">
       <w:start w:val="1"/>
       <w:numFmt w:val="bullet"/>
@@ -9299,10 +9451,10 @@
       </w:rPr>
     </w:lvl>
   </w:abstractNum>
-  <w:abstractNum w:abstractNumId="6" w15:restartNumberingAfterBreak="0">
-    <w:nsid w:val="33FA3C14"/>
+  <w:abstractNum w:abstractNumId="8" w15:restartNumberingAfterBreak="0">
+    <w:nsid w:val="770421C0"/>
     <w:multiLevelType w:val="multilevel"/>
-    <w:tmpl w:val="389891CC"/>
+    <w:tmpl w:val="17186946"/>
     <w:lvl w:ilvl="0">
       <w:start w:val="1"/>
       <w:numFmt w:val="decimal"/>
@@ -9412,123 +9564,10 @@
       </w:pPr>
     </w:lvl>
   </w:abstractNum>
-  <w:abstractNum w:abstractNumId="7" w15:restartNumberingAfterBreak="0">
-    <w:nsid w:val="398D0851"/>
+  <w:abstractNum w:abstractNumId="9" w15:restartNumberingAfterBreak="0">
+    <w:nsid w:val="7DA86C87"/>
     <w:multiLevelType w:val="multilevel"/>
-    <w:tmpl w:val="68480998"/>
-    <w:lvl w:ilvl="0">
-      <w:start w:val="1"/>
-      <w:numFmt w:val="decimal"/>
-      <w:lvlText w:val="%1."/>
-      <w:lvlJc w:val="left"/>
-      <w:pPr>
-        <w:tabs>
-          <w:tab w:val="num" w:pos="720"/>
-        </w:tabs>
-        <w:ind w:left="720" w:hanging="360"/>
-      </w:pPr>
-    </w:lvl>
-    <w:lvl w:ilvl="1" w:tentative="1">
-      <w:start w:val="1"/>
-      <w:numFmt w:val="decimal"/>
-      <w:lvlText w:val="%2."/>
-      <w:lvlJc w:val="left"/>
-      <w:pPr>
-        <w:tabs>
-          <w:tab w:val="num" w:pos="1440"/>
-        </w:tabs>
-        <w:ind w:left="1440" w:hanging="360"/>
-      </w:pPr>
-    </w:lvl>
-    <w:lvl w:ilvl="2" w:tentative="1">
-      <w:start w:val="1"/>
-      <w:numFmt w:val="decimal"/>
-      <w:lvlText w:val="%3."/>
-      <w:lvlJc w:val="left"/>
-      <w:pPr>
-        <w:tabs>
-          <w:tab w:val="num" w:pos="2160"/>
-        </w:tabs>
-        <w:ind w:left="2160" w:hanging="360"/>
-      </w:pPr>
-    </w:lvl>
-    <w:lvl w:ilvl="3" w:tentative="1">
-      <w:start w:val="1"/>
-      <w:numFmt w:val="decimal"/>
-      <w:lvlText w:val="%4."/>
-      <w:lvlJc w:val="left"/>
-      <w:pPr>
-        <w:tabs>
-          <w:tab w:val="num" w:pos="2880"/>
-        </w:tabs>
-        <w:ind w:left="2880" w:hanging="360"/>
-      </w:pPr>
-    </w:lvl>
-    <w:lvl w:ilvl="4" w:tentative="1">
-      <w:start w:val="1"/>
-      <w:numFmt w:val="decimal"/>
-      <w:lvlText w:val="%5."/>
-      <w:lvlJc w:val="left"/>
-      <w:pPr>
-        <w:tabs>
-          <w:tab w:val="num" w:pos="3600"/>
-        </w:tabs>
-        <w:ind w:left="3600" w:hanging="360"/>
-      </w:pPr>
-    </w:lvl>
-    <w:lvl w:ilvl="5" w:tentative="1">
-      <w:start w:val="1"/>
-      <w:numFmt w:val="decimal"/>
-      <w:lvlText w:val="%6."/>
-      <w:lvlJc w:val="left"/>
-      <w:pPr>
-        <w:tabs>
-          <w:tab w:val="num" w:pos="4320"/>
-        </w:tabs>
-        <w:ind w:left="4320" w:hanging="360"/>
-      </w:pPr>
-    </w:lvl>
-    <w:lvl w:ilvl="6" w:tentative="1">
-      <w:start w:val="1"/>
-      <w:numFmt w:val="decimal"/>
-      <w:lvlText w:val="%7."/>
-      <w:lvlJc w:val="left"/>
-      <w:pPr>
-        <w:tabs>
-          <w:tab w:val="num" w:pos="5040"/>
-        </w:tabs>
-        <w:ind w:left="5040" w:hanging="360"/>
-      </w:pPr>
-    </w:lvl>
-    <w:lvl w:ilvl="7" w:tentative="1">
-      <w:start w:val="1"/>
-      <w:numFmt w:val="decimal"/>
-      <w:lvlText w:val="%8."/>
-      <w:lvlJc w:val="left"/>
-      <w:pPr>
-        <w:tabs>
-          <w:tab w:val="num" w:pos="5760"/>
-        </w:tabs>
-        <w:ind w:left="5760" w:hanging="360"/>
-      </w:pPr>
-    </w:lvl>
-    <w:lvl w:ilvl="8" w:tentative="1">
-      <w:start w:val="1"/>
-      <w:numFmt w:val="decimal"/>
-      <w:lvlText w:val="%9."/>
-      <w:lvlJc w:val="left"/>
-      <w:pPr>
-        <w:tabs>
-          <w:tab w:val="num" w:pos="6480"/>
-        </w:tabs>
-        <w:ind w:left="6480" w:hanging="360"/>
-      </w:pPr>
-    </w:lvl>
-  </w:abstractNum>
-  <w:abstractNum w:abstractNumId="8" w15:restartNumberingAfterBreak="0">
-    <w:nsid w:val="43CF2982"/>
-    <w:multiLevelType w:val="multilevel"/>
-    <w:tmpl w:val="510A7306"/>
+    <w:tmpl w:val="914A43CA"/>
     <w:lvl w:ilvl="0">
       <w:start w:val="1"/>
       <w:numFmt w:val="bullet"/>
@@ -9674,148 +9713,35 @@
       </w:rPr>
     </w:lvl>
   </w:abstractNum>
-  <w:abstractNum w:abstractNumId="9" w15:restartNumberingAfterBreak="0">
-    <w:nsid w:val="49B8586B"/>
-    <w:multiLevelType w:val="multilevel"/>
-    <w:tmpl w:val="9E4C747A"/>
-    <w:lvl w:ilvl="0">
-      <w:start w:val="1"/>
-      <w:numFmt w:val="decimal"/>
-      <w:lvlText w:val="%1."/>
-      <w:lvlJc w:val="left"/>
-      <w:pPr>
-        <w:tabs>
-          <w:tab w:val="num" w:pos="720"/>
-        </w:tabs>
-        <w:ind w:left="720" w:hanging="360"/>
-      </w:pPr>
-    </w:lvl>
-    <w:lvl w:ilvl="1" w:tentative="1">
-      <w:start w:val="1"/>
-      <w:numFmt w:val="decimal"/>
-      <w:lvlText w:val="%2."/>
-      <w:lvlJc w:val="left"/>
-      <w:pPr>
-        <w:tabs>
-          <w:tab w:val="num" w:pos="1440"/>
-        </w:tabs>
-        <w:ind w:left="1440" w:hanging="360"/>
-      </w:pPr>
-    </w:lvl>
-    <w:lvl w:ilvl="2" w:tentative="1">
-      <w:start w:val="1"/>
-      <w:numFmt w:val="decimal"/>
-      <w:lvlText w:val="%3."/>
-      <w:lvlJc w:val="left"/>
-      <w:pPr>
-        <w:tabs>
-          <w:tab w:val="num" w:pos="2160"/>
-        </w:tabs>
-        <w:ind w:left="2160" w:hanging="360"/>
-      </w:pPr>
-    </w:lvl>
-    <w:lvl w:ilvl="3" w:tentative="1">
-      <w:start w:val="1"/>
-      <w:numFmt w:val="decimal"/>
-      <w:lvlText w:val="%4."/>
-      <w:lvlJc w:val="left"/>
-      <w:pPr>
-        <w:tabs>
-          <w:tab w:val="num" w:pos="2880"/>
-        </w:tabs>
-        <w:ind w:left="2880" w:hanging="360"/>
-      </w:pPr>
-    </w:lvl>
-    <w:lvl w:ilvl="4" w:tentative="1">
-      <w:start w:val="1"/>
-      <w:numFmt w:val="decimal"/>
-      <w:lvlText w:val="%5."/>
-      <w:lvlJc w:val="left"/>
-      <w:pPr>
-        <w:tabs>
-          <w:tab w:val="num" w:pos="3600"/>
-        </w:tabs>
-        <w:ind w:left="3600" w:hanging="360"/>
-      </w:pPr>
-    </w:lvl>
-    <w:lvl w:ilvl="5" w:tentative="1">
-      <w:start w:val="1"/>
-      <w:numFmt w:val="decimal"/>
-      <w:lvlText w:val="%6."/>
-      <w:lvlJc w:val="left"/>
-      <w:pPr>
-        <w:tabs>
-          <w:tab w:val="num" w:pos="4320"/>
-        </w:tabs>
-        <w:ind w:left="4320" w:hanging="360"/>
-      </w:pPr>
-    </w:lvl>
-    <w:lvl w:ilvl="6" w:tentative="1">
-      <w:start w:val="1"/>
-      <w:numFmt w:val="decimal"/>
-      <w:lvlText w:val="%7."/>
-      <w:lvlJc w:val="left"/>
-      <w:pPr>
-        <w:tabs>
-          <w:tab w:val="num" w:pos="5040"/>
-        </w:tabs>
-        <w:ind w:left="5040" w:hanging="360"/>
-      </w:pPr>
-    </w:lvl>
-    <w:lvl w:ilvl="7" w:tentative="1">
-      <w:start w:val="1"/>
-      <w:numFmt w:val="decimal"/>
-      <w:lvlText w:val="%8."/>
-      <w:lvlJc w:val="left"/>
-      <w:pPr>
-        <w:tabs>
-          <w:tab w:val="num" w:pos="5760"/>
-        </w:tabs>
-        <w:ind w:left="5760" w:hanging="360"/>
-      </w:pPr>
-    </w:lvl>
-    <w:lvl w:ilvl="8" w:tentative="1">
-      <w:start w:val="1"/>
-      <w:numFmt w:val="decimal"/>
-      <w:lvlText w:val="%9."/>
-      <w:lvlJc w:val="left"/>
-      <w:pPr>
-        <w:tabs>
-          <w:tab w:val="num" w:pos="6480"/>
-        </w:tabs>
-        <w:ind w:left="6480" w:hanging="360"/>
-      </w:pPr>
-    </w:lvl>
-  </w:abstractNum>
-  <w:num w:numId="1" w16cid:durableId="286855263">
+  <w:num w:numId="1" w16cid:durableId="783230238">
     <w:abstractNumId w:val="4"/>
   </w:num>
-  <w:num w:numId="2" w16cid:durableId="1367481415">
+  <w:num w:numId="2" w16cid:durableId="399644461">
     <w:abstractNumId w:val="1"/>
   </w:num>
-  <w:num w:numId="3" w16cid:durableId="1030226883">
+  <w:num w:numId="3" w16cid:durableId="2145779987">
+    <w:abstractNumId w:val="5"/>
+  </w:num>
+  <w:num w:numId="4" w16cid:durableId="196235622">
+    <w:abstractNumId w:val="3"/>
+  </w:num>
+  <w:num w:numId="5" w16cid:durableId="508254531">
+    <w:abstractNumId w:val="8"/>
+  </w:num>
+  <w:num w:numId="6" w16cid:durableId="215552085">
+    <w:abstractNumId w:val="9"/>
+  </w:num>
+  <w:num w:numId="7" w16cid:durableId="367032057">
+    <w:abstractNumId w:val="6"/>
+  </w:num>
+  <w:num w:numId="8" w16cid:durableId="1854563547">
+    <w:abstractNumId w:val="0"/>
+  </w:num>
+  <w:num w:numId="9" w16cid:durableId="55277409">
     <w:abstractNumId w:val="7"/>
   </w:num>
-  <w:num w:numId="4" w16cid:durableId="1705859368">
-    <w:abstractNumId w:val="9"/>
-  </w:num>
-  <w:num w:numId="5" w16cid:durableId="1814373337">
-    <w:abstractNumId w:val="3"/>
-  </w:num>
-  <w:num w:numId="6" w16cid:durableId="806360979">
+  <w:num w:numId="10" w16cid:durableId="43069200">
     <w:abstractNumId w:val="2"/>
-  </w:num>
-  <w:num w:numId="7" w16cid:durableId="2104376168">
-    <w:abstractNumId w:val="0"/>
-  </w:num>
-  <w:num w:numId="8" w16cid:durableId="1218053954">
-    <w:abstractNumId w:val="5"/>
-  </w:num>
-  <w:num w:numId="9" w16cid:durableId="131677072">
-    <w:abstractNumId w:val="8"/>
-  </w:num>
-  <w:num w:numId="10" w16cid:durableId="1850751120">
-    <w:abstractNumId w:val="6"/>
   </w:num>
 </w:numbering>
 </file>

</xml_diff>